<commit_message>
Generalize analyza template beyond SEO/PPC to any structured document
The template's cover kicker, title, subtitle, cover note, and the
dark/light comparison info boxes still carried SEO/PPC-specific
example text and framing. Genericized all of it to bracketed
placeholders ([TYP DOKUMENTU], [Nazev dokumentu], [Moznost A/B]
comparison boxes, optional cover note) and renamed the "Zdroje obalky"
style to "Poznamka obalky" since the cover note isn't always about
data sources. README reframed: this is a general-purpose structured
document template (any analysis, audit, report, or internal doc),
not an SEO/PPC-specific one.

Co-Authored-By: Claude Sonnet 5 <noreply@anthropic.com>
</commit_message>
<xml_diff>
--- a/docs/templates/analyza/vzor-analyza.docx
+++ b/docs/templates/analyza/vzor-analyza.docx
@@ -76,7 +76,7 @@
               <w:pStyle w:val="AITOMKickerobalky"/>
             </w:pPr>
             <w:r>
-              <w:t xml:space="preserve">INDIKATIVNÍ ANALÝZA</w:t>
+              <w:t xml:space="preserve">[TYP DOKUMENTU]</w:t>
             </w:r>
           </w:p>
           <w:p>
@@ -84,7 +84,7 @@
               <w:pStyle w:val="AITOMTituleklobalky"/>
             </w:pPr>
             <w:r>
-              <w:t xml:space="preserve">SEO &amp; PPC</w:t>
+              <w:t xml:space="preserve">[Název dokumentu]</w:t>
             </w:r>
           </w:p>
           <w:p>
@@ -139,7 +139,7 @@
               <w:pStyle w:val="AITOMPodtituleklobalky"/>
             </w:pPr>
             <w:r>
-              <w:t xml:space="preserve">Indikativní analýza výkonnosti a strategický plán</w:t>
+              <w:t xml:space="preserve">[Popisný podtitulek dokumentu]</w:t>
             </w:r>
           </w:p>
           <w:p>
@@ -155,7 +155,7 @@
               <w:pStyle w:val="AITOMZdrojelobalky"/>
             </w:pPr>
             <w:r>
-              <w:t xml:space="preserve">Datové podklady: Google Search Console, Screaming Frog, Collabim, Google Ads Planner, Ahrefs, APIFY</w:t>
+              <w:t xml:space="preserve">[Nepovinná poznámka na obálce — např. zdroje dat, verze, datum]</w:t>
             </w:r>
           </w:p>
         </w:tc>
@@ -184,7 +184,7 @@
     </w:p>
     <w:p>
       <w:r>
-        <w:t xml:space="preserve">Web [klient].cz generuje provoz převážně prostřednictvím brandových dotazů; nebrandová klíčová slova mají zatím nízkou viditelnost. (Ukázkový odstavec — nahraď reálným shrnutím analýzy.)</w:t>
+        <w:t xml:space="preserve">[Úvodní odstavec — shrnutí, kontext nebo hlavní téma dokumentu. Nahraď reálným textem.]</w:t>
       </w:r>
     </w:p>
     <w:tbl>
@@ -225,7 +225,7 @@
               <w:pStyle w:val="AITOMBoxtmavynadpis"/>
             </w:pPr>
             <w:r>
-              <w:t xml:space="preserve">SEO — Doporučeno: ANO</w:t>
+              <w:t xml:space="preserve">[Možnost A] — Doporučeno: [ANO/NE]</w:t>
             </w:r>
           </w:p>
           <w:p>
@@ -234,7 +234,7 @@
               <w:spacing w:before="0" w:after="0" w:line="336" w:lineRule="auto"/>
             </w:pPr>
             <w:r>
-              <w:t xml:space="preserve">Střednědobý základ, nutná podmínka pro organickou viditelnost. Výsledky za 6–12 měsíců. (Ukázkový text doporučení.)</w:t>
+              <w:t xml:space="preserve">[Zdůvodnění doporučení — 2–3 věty.]</w:t>
             </w:r>
           </w:p>
         </w:tc>
@@ -262,7 +262,7 @@
               <w:pStyle w:val="AITOMBoxsvetlynadpis"/>
             </w:pPr>
             <w:r>
-              <w:t xml:space="preserve">PPC — Doporučeno: ANO</w:t>
+              <w:t xml:space="preserve">[Možnost B] — Doporučeno: [ANO/NE]</w:t>
             </w:r>
           </w:p>
           <w:p>
@@ -270,7 +270,7 @@
               <w:spacing w:before="0" w:after="0" w:line="336" w:lineRule="auto"/>
             </w:pPr>
             <w:r>
-              <w:t xml:space="preserve">Okamžitá viditelnost, validace poptávky. (Ukázkový text doporučení — nahraď reálným rozsahem a budgetem.)</w:t>
+              <w:t xml:space="preserve">[Zdůvodnění doporučení — 2–3 věty.]</w:t>
             </w:r>
           </w:p>
         </w:tc>
@@ -326,7 +326,7 @@
               <w:spacing w:before="0" w:after="0" w:line="336" w:lineRule="auto"/>
             </w:pPr>
             <w:r>
-              <w:t xml:space="preserve">[Shrnutí klíčového zjištění analýzy — 2–4 věty, nejdůležitější insight z dat.]</w:t>
+              <w:t xml:space="preserve">[Shrnutí klíčového zjištění / hlavní myšlenka dokumentu — 2–4 věty.]</w:t>
             </w:r>
           </w:p>
         </w:tc>
@@ -1260,7 +1260,7 @@
       </w:tabs>
     </w:pPr>
     <w:r>
-      <w:t>[klient].cz  —  SEO &amp; PPC analýza</w:t>
+      <w:t>[klient]  —  [Název dokumentu]</w:t>
     </w:r>
     <w:r>
       <w:tab/>
@@ -1330,7 +1330,7 @@
       <w:tab/>
     </w:r>
     <w:r>
-      <w:t>Indikativní analýza  ·  SEO &amp; PPC</w:t>
+      <w:t>[Typ dokumentu]  ·  [Název dokumentu]</w:t>
     </w:r>
   </w:p>
 </w:hdr>
@@ -13458,7 +13458,7 @@
     </w:rPr>
   </w:style>
   <w:style w:type="paragraph" w:customStyle="1" w:styleId="AITOMZdrojelobalky">
-    <w:name w:val="AITOM - Zdroje obálky"/>
+    <w:name w:val="AITOM - Poznámka obálky"/>
     <w:basedOn w:val="Normal"/>
     <w:qFormat/>
     <w:pPr>

</xml_diff>

<commit_message>
Add general-purpose components to analyza template + brand chart theme
New page 3 adds reusable elements identified from a real case-study
example: H3 heading, quote/testimonial block, numbered steps with
large colored numerals, stat/KPI callout row, image placeholder with
caption, native numbered list, and a neutral gray note box (kept
separate from the green box, which is reserved for genuinely key
findings).

Also remaps the document theme's accent colors (theme1.xml) from
generic Office blue/red/olive to the AITOM palette, so any native
Word chart or SmartArt a person inserts defaults to on-brand colors
instead of requiring manual recoloring.

Co-Authored-By: Claude Sonnet 5 <noreply@anthropic.com>
</commit_message>
<xml_diff>
--- a/docs/templates/analyza/vzor-analyza.docx
+++ b/docs/templates/analyza/vzor-analyza.docx
@@ -1235,6 +1235,472 @@
       </w:tr>
     </w:tbl>
     <w:p>
+      <w:r>
+        <w:br w:type="page"/>
+      </w:r>
+    </w:p>
+    <w:p>
+      <w:pPr>
+        <w:pStyle w:val="AITOMNadpiskapitoly"/>
+      </w:pPr>
+      <w:r>
+        <w:t xml:space="preserve">2  </w:t>
+      </w:r>
+      <w:r>
+        <w:t>Doplňkové prvky</w:t>
+      </w:r>
+    </w:p>
+    <w:p>
+      <w:pPr>
+        <w:pStyle w:val="AITOMNadpisuroven3"/>
+      </w:pPr>
+      <w:r>
+        <w:t xml:space="preserve">Nadpis úrovně 3</w:t>
+      </w:r>
+    </w:p>
+    <w:p>
+      <w:r>
+        <w:t xml:space="preserve">[Text pod nadpisem úrovně 3 — pro jemnější členění obsahu uvnitř podkapitoly.]</w:t>
+      </w:r>
+    </w:p>
+    <w:p>
+      <w:pPr>
+        <w:spacing w:after="80"/>
+      </w:pPr>
+    </w:p>
+    <w:p>
+      <w:pPr>
+        <w:pStyle w:val="AITOMCitacetext"/>
+      </w:pPr>
+      <w:r>
+        <w:t xml:space="preserve">„[Citace klienta nebo reference — 2–4 věty shrnující spokojenost nebo výsledek spolupráce.]“</w:t>
+      </w:r>
+    </w:p>
+    <w:p>
+      <w:pPr>
+        <w:pStyle w:val="AITOMCitaceautor"/>
+      </w:pPr>
+      <w:r>
+        <w:t xml:space="preserve">[Jméno Příjmení]</w:t>
+      </w:r>
+    </w:p>
+    <w:p>
+      <w:pPr>
+        <w:pStyle w:val="AITOMCitaceroleafirma"/>
+      </w:pPr>
+      <w:r>
+        <w:t xml:space="preserve">[Pozice], [Společnost]</w:t>
+      </w:r>
+    </w:p>
+    <w:p>
+      <w:pPr>
+        <w:spacing w:after="160"/>
+      </w:pPr>
+    </w:p>
+    <w:tbl>
+      <w:tblPr>
+        <w:tblW w:type="auto" w:w="0"/>
+        <w:tblLayout w:type="fixed"/>
+        <w:tblLook w:firstColumn="1" w:firstRow="1" w:lastColumn="0" w:lastRow="0" w:noHBand="0" w:noVBand="1" w:val="04A0"/>
+        <w:tblW w:w="9638" w:type="dxa"/>
+        <w:tblLayout w:type="fixed"/>
+        <w:tblInd w:w="0" w:type="dxa"/>
+        <w:tblBorders>
+          <w:top w:val="nil"/>
+          <w:left w:val="nil"/>
+          <w:bottom w:val="nil"/>
+          <w:right w:val="nil"/>
+          <w:insideH w:val="nil"/>
+          <w:insideV w:val="nil"/>
+        </w:tblBorders>
+      </w:tblPr>
+      <w:tblGrid>
+        <w:gridCol w:w="700"/>
+        <w:gridCol w:w="8938"/>
+      </w:tblGrid>
+      <w:tr>
+        <w:tc>
+          <w:tcPr>
+            <w:tcW w:type="dxa" w:w="700"/>
+            <w:tcBorders>
+              <w:top w:val="nil"/>
+              <w:left w:val="nil"/>
+              <w:bottom w:val="nil"/>
+              <w:right w:val="nil"/>
+            </w:tcBorders>
+            <w:tcMar>
+              <w:top w:w="0" w:type="dxa"/>
+              <w:right w:w="120" w:type="dxa"/>
+            </w:tcMar>
+            <w:vAlign w:val="top"/>
+          </w:tcPr>
+          <w:p>
+            <w:r>
+              <w:rPr>
+                <w:rStyle w:val="AITOMKrokcislo"/>
+              </w:rPr>
+              <w:t>1.</w:t>
+            </w:r>
+          </w:p>
+        </w:tc>
+        <w:tc>
+          <w:tcPr>
+            <w:tcW w:type="dxa" w:w="8938"/>
+            <w:tcBorders>
+              <w:top w:val="nil"/>
+              <w:left w:val="nil"/>
+              <w:bottom w:val="nil"/>
+              <w:right w:val="nil"/>
+            </w:tcBorders>
+            <w:vAlign w:val="top"/>
+          </w:tcPr>
+          <w:p>
+            <w:pPr>
+              <w:pStyle w:val="AITOMNadpisuroven3"/>
+              <w:spacing w:before="0" w:after="60"/>
+            </w:pPr>
+            <w:r>
+              <w:t xml:space="preserve">[Název kroku]</w:t>
+            </w:r>
+          </w:p>
+          <w:p>
+            <w:r>
+              <w:t xml:space="preserve">[Popis prvního kroku procesu.]</w:t>
+            </w:r>
+          </w:p>
+        </w:tc>
+      </w:tr>
+      <w:tr>
+        <w:tc>
+          <w:tcPr>
+            <w:tcW w:type="dxa" w:w="700"/>
+            <w:tcBorders>
+              <w:top w:val="nil"/>
+              <w:left w:val="nil"/>
+              <w:bottom w:val="nil"/>
+              <w:right w:val="nil"/>
+            </w:tcBorders>
+            <w:tcMar>
+              <w:top w:w="0" w:type="dxa"/>
+              <w:right w:w="120" w:type="dxa"/>
+            </w:tcMar>
+            <w:vAlign w:val="top"/>
+          </w:tcPr>
+          <w:p>
+            <w:r>
+              <w:rPr>
+                <w:rStyle w:val="AITOMKrokcislo"/>
+              </w:rPr>
+              <w:t>2.</w:t>
+            </w:r>
+          </w:p>
+        </w:tc>
+        <w:tc>
+          <w:tcPr>
+            <w:tcW w:type="dxa" w:w="8938"/>
+            <w:tcBorders>
+              <w:top w:val="nil"/>
+              <w:left w:val="nil"/>
+              <w:bottom w:val="nil"/>
+              <w:right w:val="nil"/>
+            </w:tcBorders>
+            <w:vAlign w:val="top"/>
+          </w:tcPr>
+          <w:p>
+            <w:pPr>
+              <w:pStyle w:val="AITOMNadpisuroven3"/>
+              <w:spacing w:before="0" w:after="60"/>
+            </w:pPr>
+            <w:r>
+              <w:t xml:space="preserve">[Název kroku]</w:t>
+            </w:r>
+          </w:p>
+          <w:p>
+            <w:r>
+              <w:t xml:space="preserve">[Popis druhého kroku procesu.]</w:t>
+            </w:r>
+          </w:p>
+        </w:tc>
+      </w:tr>
+    </w:tbl>
+    <w:p>
+      <w:pPr>
+        <w:spacing w:after="160"/>
+      </w:pPr>
+    </w:p>
+    <w:tbl>
+      <w:tblPr>
+        <w:tblW w:type="auto" w:w="0"/>
+        <w:tblLayout w:type="fixed"/>
+        <w:tblLook w:firstColumn="1" w:firstRow="1" w:lastColumn="0" w:lastRow="0" w:noHBand="0" w:noVBand="1" w:val="04A0"/>
+        <w:tblW w:w="9638" w:type="dxa"/>
+        <w:tblLayout w:type="fixed"/>
+        <w:tblInd w:w="0" w:type="dxa"/>
+        <w:tblBorders>
+          <w:top w:val="nil"/>
+          <w:left w:val="nil"/>
+          <w:bottom w:val="nil"/>
+          <w:right w:val="nil"/>
+          <w:insideH w:val="nil"/>
+          <w:insideV w:val="nil"/>
+        </w:tblBorders>
+      </w:tblPr>
+      <w:tblGrid>
+        <w:gridCol w:w="3212"/>
+        <w:gridCol w:w="3212"/>
+        <w:gridCol w:w="3214"/>
+      </w:tblGrid>
+      <w:tr>
+        <w:tc>
+          <w:tcPr>
+            <w:tcW w:type="dxa" w:w="3212"/>
+            <w:tcBorders>
+              <w:top w:val="nil"/>
+              <w:left w:val="nil"/>
+              <w:bottom w:val="nil"/>
+              <w:right w:val="nil"/>
+            </w:tcBorders>
+            <w:vAlign w:val="center"/>
+          </w:tcPr>
+          <w:p>
+            <w:pPr>
+              <w:pStyle w:val="AITOMStatistikacislo"/>
+            </w:pPr>
+            <w:r>
+              <w:t xml:space="preserve">[+XX %]</w:t>
+            </w:r>
+          </w:p>
+          <w:p>
+            <w:pPr>
+              <w:pStyle w:val="AITOMStatistikapopisek"/>
+            </w:pPr>
+            <w:r>
+              <w:t xml:space="preserve">[Popisek metriky]</w:t>
+            </w:r>
+          </w:p>
+        </w:tc>
+        <w:tc>
+          <w:tcPr>
+            <w:tcW w:type="dxa" w:w="3212"/>
+            <w:tcBorders>
+              <w:top w:val="nil"/>
+              <w:left w:val="nil"/>
+              <w:bottom w:val="nil"/>
+              <w:right w:val="nil"/>
+            </w:tcBorders>
+            <w:vAlign w:val="center"/>
+          </w:tcPr>
+          <w:p>
+            <w:pPr>
+              <w:pStyle w:val="AITOMStatistikacislo"/>
+            </w:pPr>
+            <w:r>
+              <w:t xml:space="preserve">[XX]</w:t>
+            </w:r>
+          </w:p>
+          <w:p>
+            <w:pPr>
+              <w:pStyle w:val="AITOMStatistikapopisek"/>
+            </w:pPr>
+            <w:r>
+              <w:t xml:space="preserve">[Popisek metriky]</w:t>
+            </w:r>
+          </w:p>
+        </w:tc>
+        <w:tc>
+          <w:tcPr>
+            <w:tcW w:type="dxa" w:w="3212"/>
+            <w:tcBorders>
+              <w:top w:val="nil"/>
+              <w:left w:val="nil"/>
+              <w:bottom w:val="nil"/>
+              <w:right w:val="nil"/>
+            </w:tcBorders>
+            <w:vAlign w:val="center"/>
+          </w:tcPr>
+          <w:p>
+            <w:pPr>
+              <w:pStyle w:val="AITOMStatistikacislo"/>
+            </w:pPr>
+            <w:r>
+              <w:t xml:space="preserve">1/2</w:t>
+            </w:r>
+          </w:p>
+          <w:p>
+            <w:pPr>
+              <w:pStyle w:val="AITOMStatistikapopisek"/>
+            </w:pPr>
+            <w:r>
+              <w:t xml:space="preserve">[Popisek metriky]</w:t>
+            </w:r>
+          </w:p>
+        </w:tc>
+      </w:tr>
+    </w:tbl>
+    <w:p>
+      <w:pPr>
+        <w:spacing w:after="160"/>
+      </w:pPr>
+    </w:p>
+    <w:tbl>
+      <w:tblPr>
+        <w:tblW w:type="auto" w:w="0"/>
+        <w:jc w:val="center"/>
+        <w:tblLayout w:type="fixed"/>
+        <w:tblLook w:firstColumn="1" w:firstRow="1" w:lastColumn="0" w:lastRow="0" w:noHBand="0" w:noVBand="1" w:val="04A0"/>
+        <w:tblW w:w="9638" w:type="dxa"/>
+        <w:tblLayout w:type="fixed"/>
+        <w:tblInd w:w="0" w:type="dxa"/>
+      </w:tblPr>
+      <w:tblGrid>
+        <w:gridCol w:w="9638"/>
+      </w:tblGrid>
+      <w:tr>
+        <w:trPr>
+          <w:trHeight w:val="2400" w:hRule="exact"/>
+        </w:trPr>
+        <w:tc>
+          <w:tcPr>
+            <w:tcW w:type="dxa" w:w="9638"/>
+            <w:tcBorders>
+              <w:top w:val="single" w:sz="4" w:space="0" w:color="E4E6E4"/>
+              <w:left w:val="single" w:sz="4" w:space="0" w:color="E4E6E4"/>
+              <w:bottom w:val="single" w:sz="4" w:space="0" w:color="E4E6E4"/>
+              <w:right w:val="single" w:sz="4" w:space="0" w:color="E4E6E4"/>
+            </w:tcBorders>
+            <w:shd w:val="clear" w:color="auto" w:fill="F8FAF8"/>
+            <w:vAlign w:val="center"/>
+          </w:tcPr>
+          <w:p>
+            <w:pPr>
+              <w:jc w:val="center"/>
+            </w:pPr>
+            <w:r>
+              <w:rPr>
+                <w:rFonts w:ascii="Inter" w:hAnsi="Inter" w:cs="Inter"/>
+                <w:color w:val="828482"/>
+              </w:rPr>
+              <w:t>[Obrázek — vlož skutečnou fotku/vizuál]</w:t>
+            </w:r>
+          </w:p>
+        </w:tc>
+      </w:tr>
+    </w:tbl>
+    <w:p>
+      <w:pPr>
+        <w:pStyle w:val="AITOMPopisekobrazku"/>
+      </w:pPr>
+      <w:r>
+        <w:t xml:space="preserve">Obr. 1 — [Popisek obrázku, může obsahovat i zdroj.]</w:t>
+      </w:r>
+    </w:p>
+    <w:p>
+      <w:pPr>
+        <w:pStyle w:val="AITOMNadpisuroven3"/>
+      </w:pPr>
+      <w:r>
+        <w:t xml:space="preserve">Číslovaný seznam</w:t>
+      </w:r>
+    </w:p>
+    <w:p>
+      <w:pPr>
+        <w:pStyle w:val="AITOMCislovanyseznam"/>
+      </w:pPr>
+      <w:r>
+        <w:t xml:space="preserve">[První bod postupu.]</w:t>
+      </w:r>
+    </w:p>
+    <w:p>
+      <w:pPr>
+        <w:pStyle w:val="AITOMCislovanyseznam"/>
+      </w:pPr>
+      <w:r>
+        <w:t xml:space="preserve">[Druhý bod postupu.]</w:t>
+      </w:r>
+    </w:p>
+    <w:p>
+      <w:pPr>
+        <w:pStyle w:val="AITOMCislovanyseznam"/>
+      </w:pPr>
+      <w:r>
+        <w:t xml:space="preserve">[Třetí bod postupu.]</w:t>
+      </w:r>
+    </w:p>
+    <w:p>
+      <w:pPr>
+        <w:spacing w:after="160"/>
+      </w:pPr>
+    </w:p>
+    <w:tbl>
+      <w:tblPr>
+        <w:tblW w:type="auto" w:w="0"/>
+        <w:tblLayout w:type="fixed"/>
+        <w:tblLook w:firstColumn="1" w:firstRow="1" w:lastColumn="0" w:lastRow="0" w:noHBand="0" w:noVBand="1" w:val="04A0"/>
+        <w:tblW w:w="9638" w:type="dxa"/>
+        <w:tblLayout w:type="fixed"/>
+        <w:tblInd w:w="0" w:type="dxa"/>
+      </w:tblPr>
+      <w:tblGrid>
+        <w:gridCol w:w="9638"/>
+      </w:tblGrid>
+      <w:tr>
+        <w:tc>
+          <w:tcPr>
+            <w:tcW w:type="dxa" w:w="9638"/>
+            <w:tcBorders>
+              <w:top w:val="single" w:sz="4" w:space="0" w:color="F8FAF8"/>
+              <w:left w:val="single" w:sz="36" w:space="0" w:color="C9CBC9"/>
+              <w:bottom w:val="single" w:sz="4" w:space="0" w:color="F8FAF8"/>
+              <w:right w:val="single" w:sz="4" w:space="0" w:color="F8FAF8"/>
+            </w:tcBorders>
+            <w:shd w:val="clear" w:color="auto" w:fill="F8FAF8"/>
+            <w:tcMar>
+              <w:top w:w="140" w:type="dxa"/>
+              <w:start w:w="200" w:type="dxa"/>
+              <w:left w:w="200" w:type="dxa"/>
+              <w:bottom w:w="140" w:type="dxa"/>
+              <w:end w:w="200" w:type="dxa"/>
+              <w:right w:w="200" w:type="dxa"/>
+            </w:tcMar>
+          </w:tcPr>
+          <w:p>
+            <w:pPr>
+              <w:pStyle w:val="AITOMSedyboxpopisek"/>
+            </w:pPr>
+            <w:r>
+              <w:t xml:space="preserve">POZNÁMKA</w:t>
+            </w:r>
+          </w:p>
+          <w:p>
+            <w:pPr>
+              <w:spacing w:before="0" w:after="0" w:line="336" w:lineRule="auto"/>
+            </w:pPr>
+            <w:r>
+              <w:t xml:space="preserve">[Neutrální poznámka, upozornění nebo metodická vsuvka — na rozdíl od zeleného boxu nejde o klíčové zjištění, proto je bez zeleného akcentu.]</w:t>
+            </w:r>
+          </w:p>
+        </w:tc>
+      </w:tr>
+    </w:tbl>
+    <w:p>
+      <w:pPr>
+        <w:spacing w:after="160"/>
+      </w:pPr>
+    </w:p>
+    <w:p>
+      <w:pPr>
+        <w:pStyle w:val="AITOMNadpisuroven3"/>
+      </w:pPr>
+      <w:r>
+        <w:t xml:space="preserve">Grafy (koláčový, sloupcový, spojnicový…)</w:t>
+      </w:r>
+    </w:p>
+    <w:p>
+      <w:r>
+        <w:t xml:space="preserve">[Pro grafy použij nativní graf Wordu — Vložení → Graf. Barevné schéma dokumentu je nastavené na značkové barvy AITOM (zelená, černá, šedá), takže výchozí barvy grafu budou automaticky on-brand. Nekresli grafy jako obrázek ani ručně v textu.]</w:t>
+      </w:r>
+    </w:p>
+    <w:p>
       <w:pPr>
         <w:sectPr>
           <w:headerReference w:type="default" r:id="rId11"/>
@@ -1509,6 +1975,25 @@
       </w:rPr>
     </w:lvl>
   </w:abstractNum>
+  <w:abstractNum w:abstractNumId="9">
+    <w:nsid w:val="7A1B2C3D"/>
+    <w:multiLevelType w:val="singleLevel"/>
+    <w:tmpl w:val="7A1B2C3D"/>
+    <w:lvl w:ilvl="0">
+      <w:start w:val="1"/>
+      <w:numFmt w:val="decimal"/>
+      <w:lvlText w:val="%1."/>
+      <w:lvlJc w:val="left"/>
+      <w:pPr>
+        <w:ind w:left="425" w:hanging="425"/>
+      </w:pPr>
+      <w:rPr>
+        <w:rFonts w:ascii="Space Grotesk" w:hAnsi="Space Grotesk" w:cs="Space Grotesk"/>
+        <w:b/>
+        <w:color w:val="4CE500"/>
+      </w:rPr>
+    </w:lvl>
+  </w:abstractNum>
   <w:num w:numId="1">
     <w:abstractNumId w:val="8"/>
   </w:num>
@@ -1535,6 +2020,9 @@
   </w:num>
   <w:num w:numId="9">
     <w:abstractNumId w:val="0"/>
+  </w:num>
+  <w:num w:numId="10">
+    <w:abstractNumId w:val="9"/>
   </w:num>
 </w:numbering>
 </file>
@@ -13691,6 +14179,153 @@
       </w:tblBorders>
     </w:tblPr>
   </w:style>
+  <w:style w:type="paragraph" w:customStyle="1" w:styleId="AITOMNadpisuroven3">
+    <w:name w:val="AITOM - Nadpis úrovně 3"/>
+    <w:basedOn w:val="Normal"/>
+    <w:next w:val="Normal"/>
+    <w:qFormat/>
+    <w:pPr>
+      <w:keepNext/>
+      <w:spacing w:before="240" w:after="80"/>
+    </w:pPr>
+    <w:rPr>
+      <w:rFonts w:ascii="Space Grotesk" w:eastAsia="Space Grotesk" w:hAnsi="Space Grotesk" w:cs="Space Grotesk"/>
+      <w:b/>
+      <w:color w:val="0B0D0B"/>
+      <w:sz w:val="22"/>
+    </w:rPr>
+  </w:style>
+  <w:style w:type="paragraph" w:customStyle="1" w:styleId="AITOMCitacetext">
+    <w:name w:val="AITOM - Citace text"/>
+    <w:basedOn w:val="Normal"/>
+    <w:qFormat/>
+    <w:pPr>
+      <w:spacing w:before="100" w:after="160" w:line="336" w:lineRule="auto"/>
+      <w:ind w:left="300" w:right="300"/>
+    </w:pPr>
+    <w:rPr>
+      <w:rFonts w:ascii="Inter" w:hAnsi="Inter" w:cs="Inter"/>
+      <w:i/>
+      <w:color w:val="0B0D0B"/>
+      <w:sz w:val="24"/>
+    </w:rPr>
+  </w:style>
+  <w:style w:type="paragraph" w:customStyle="1" w:styleId="AITOMCitaceautor">
+    <w:name w:val="AITOM - Citace autor"/>
+    <w:basedOn w:val="Normal"/>
+    <w:qFormat/>
+    <w:pPr>
+      <w:spacing w:before="0" w:after="0"/>
+      <w:ind w:left="300"/>
+    </w:pPr>
+    <w:rPr>
+      <w:rFonts w:ascii="Space Grotesk" w:hAnsi="Space Grotesk" w:cs="Space Grotesk"/>
+      <w:b/>
+      <w:color w:val="0B0D0B"/>
+      <w:sz w:val="19"/>
+    </w:rPr>
+  </w:style>
+  <w:style w:type="paragraph" w:customStyle="1" w:styleId="AITOMCitaceroleafirma">
+    <w:name w:val="AITOM - Citace role a firma"/>
+    <w:basedOn w:val="Normal"/>
+    <w:qFormat/>
+    <w:pPr>
+      <w:spacing w:before="0" w:after="120"/>
+      <w:ind w:left="300"/>
+    </w:pPr>
+    <w:rPr>
+      <w:rFonts w:ascii="Inter" w:hAnsi="Inter" w:cs="Inter"/>
+      <w:i/>
+      <w:color w:val="828482"/>
+      <w:sz w:val="17"/>
+    </w:rPr>
+  </w:style>
+  <w:style w:type="character" w:customStyle="1" w:styleId="AITOMKrokcislo">
+    <w:name w:val="AITOM - Krok číslo"/>
+    <w:basedOn w:val="DefaultParagraphFont"/>
+    <w:qFormat/>
+    <w:rPr>
+      <w:rFonts w:ascii="Space Grotesk" w:hAnsi="Space Grotesk" w:cs="Space Grotesk"/>
+      <w:b/>
+      <w:color w:val="4CE500"/>
+      <w:sz w:val="36"/>
+    </w:rPr>
+  </w:style>
+  <w:style w:type="paragraph" w:customStyle="1" w:styleId="AITOMStatistikacislo">
+    <w:name w:val="AITOM - Statistika číslo"/>
+    <w:basedOn w:val="Normal"/>
+    <w:qFormat/>
+    <w:pPr>
+      <w:spacing w:before="0" w:after="20"/>
+      <w:jc w:val="center"/>
+    </w:pPr>
+    <w:rPr>
+      <w:rFonts w:ascii="Space Grotesk" w:hAnsi="Space Grotesk" w:cs="Space Grotesk"/>
+      <w:b/>
+      <w:color w:val="0B0D0B"/>
+      <w:sz w:val="48"/>
+    </w:rPr>
+  </w:style>
+  <w:style w:type="paragraph" w:customStyle="1" w:styleId="AITOMStatistikapopisek">
+    <w:name w:val="AITOM - Statistika popisek"/>
+    <w:basedOn w:val="Normal"/>
+    <w:qFormat/>
+    <w:pPr>
+      <w:spacing w:before="0" w:after="0"/>
+      <w:jc w:val="center"/>
+    </w:pPr>
+    <w:rPr>
+      <w:rFonts w:ascii="Inter" w:hAnsi="Inter" w:cs="Inter"/>
+      <w:b/>
+      <w:color w:val="828482"/>
+      <w:sz w:val="15"/>
+      <w:spacing w:val="20"/>
+      <w:caps/>
+    </w:rPr>
+  </w:style>
+  <w:style w:type="paragraph" w:customStyle="1" w:styleId="AITOMPopisekobrazku">
+    <w:name w:val="AITOM - Popisek obrázku"/>
+    <w:basedOn w:val="Normal"/>
+    <w:qFormat/>
+    <w:pPr>
+      <w:spacing w:before="80" w:after="160"/>
+      <w:jc w:val="center"/>
+    </w:pPr>
+    <w:rPr>
+      <w:rFonts w:ascii="Inter" w:hAnsi="Inter" w:cs="Inter"/>
+      <w:i/>
+      <w:color w:val="828482"/>
+      <w:sz w:val="17"/>
+    </w:rPr>
+  </w:style>
+  <w:style w:type="paragraph" w:customStyle="1" w:styleId="AITOMCislovanyseznam">
+    <w:name w:val="AITOM - Číslovaný seznam"/>
+    <w:basedOn w:val="Normal"/>
+    <w:qFormat/>
+    <w:pPr>
+      <w:numPr>
+        <w:ilvl w:val="0"/>
+        <w:numId w:val="10"/>
+      </w:numPr>
+      <w:spacing w:before="0" w:after="100" w:line="331" w:lineRule="auto"/>
+    </w:pPr>
+  </w:style>
+  <w:style w:type="paragraph" w:customStyle="1" w:styleId="AITOMSedyboxpopisek">
+    <w:name w:val="AITOM - Šedý box popisek"/>
+    <w:basedOn w:val="Normal"/>
+    <w:qFormat/>
+    <w:pPr>
+      <w:spacing w:before="0" w:after="80"/>
+    </w:pPr>
+    <w:rPr>
+      <w:rFonts w:ascii="Space Grotesk" w:eastAsia="Space Grotesk" w:hAnsi="Space Grotesk" w:cs="Space Grotesk"/>
+      <w:b/>
+      <w:color w:val="828482"/>
+      <w:sz w:val="19"/>
+      <w:spacing w:val="16"/>
+      <w:caps/>
+    </w:rPr>
+  </w:style>
 </w:styles>
 </file>
 
@@ -25507,28 +26142,28 @@
         <a:sysClr val="window" lastClr="FFFFFF"/>
       </a:lt1>
       <a:dk2>
-        <a:srgbClr val="1F497D"/>
+        <a:srgbClr val="0B0D0B"/>
       </a:dk2>
       <a:lt2>
-        <a:srgbClr val="EEECE1"/>
+        <a:srgbClr val="F8FAF8"/>
       </a:lt2>
       <a:accent1>
-        <a:srgbClr val="4F81BD"/>
+        <a:srgbClr val="4CE500"/>
       </a:accent1>
       <a:accent2>
-        <a:srgbClr val="C0504D"/>
+        <a:srgbClr val="0B0D0B"/>
       </a:accent2>
       <a:accent3>
-        <a:srgbClr val="9BBB59"/>
+        <a:srgbClr val="828482"/>
       </a:accent3>
       <a:accent4>
-        <a:srgbClr val="8064A2"/>
+        <a:srgbClr val="BDE500"/>
       </a:accent4>
       <a:accent5>
-        <a:srgbClr val="4BACC6"/>
+        <a:srgbClr val="C9CBC9"/>
       </a:accent5>
       <a:accent6>
-        <a:srgbClr val="F79646"/>
+        <a:srgbClr val="3C7A0A"/>
       </a:accent6>
       <a:hlink>
         <a:srgbClr val="0000FF"/>

</xml_diff>